<commit_message>
Add full certificates section to website and update CV with all certificates
</commit_message>
<xml_diff>
--- a/assets/Muhammet-Emin-Gul-CV.docx
+++ b/assets/Muhammet-Emin-Gul-CV.docx
@@ -15,7 +15,7 @@
     <w:p>
       <w:pPr>
         <w:pStyle w:val="CVSmall"/>
-        <w:spacing w:after="20" w:line="200" w:lineRule="auto"/>
+        <w:spacing w:after="16" w:line="190" w:lineRule="auto"/>
         <w:jc w:val="center"/>
       </w:pPr>
       <w:r>
@@ -28,7 +28,7 @@
     <w:p>
       <w:pPr>
         <w:pStyle w:val="CVHeading"/>
-        <w:spacing w:before="36" w:after="16"/>
+        <w:spacing w:before="30" w:after="10"/>
       </w:pPr>
       <w:r>
         <w:t>PROFİL</w:t>
@@ -37,7 +37,7 @@
     <w:p>
       <w:pPr>
         <w:pStyle w:val="CVBody"/>
-        <w:spacing w:after="16" w:line="210" w:lineRule="auto"/>
+        <w:spacing w:after="10" w:line="200" w:lineRule="auto"/>
       </w:pPr>
       <w:r>
         <w:t xml:space="preserve">Bilişim Güvenliği Teknolojileri alanında eğitim gören, siber güvenlik, ağ güvenliği ve yazılım geliştirme konularına ilgi duyan bir öğrenciyim. Python, Flutter, SQL ve temel web teknolojileri ile projeler geliştiriyorum. Ağ tarama, risk analizi, parola yönetimi, yerel veri saklama ve kullanıcı arayüzü geliştirme alanlarında uygulamalı çalışmalar yaptım. Kariyer hedefim; siber güvenlik, ağ güvenliği, teknik destek veya yazılım geliştirme alanlarında kendimi geliştirerek profesyonel iş hayatına güçlü bir başlangıç yapmaktır. </w:t>
@@ -49,7 +49,7 @@
     <w:p>
       <w:pPr>
         <w:pStyle w:val="CVHeading"/>
-        <w:spacing w:before="36" w:after="16"/>
+        <w:spacing w:before="30" w:after="10"/>
       </w:pPr>
       <w:r>
         <w:t>EĞİTİM</w:t>
@@ -58,7 +58,7 @@
     <w:p>
       <w:pPr>
         <w:pStyle w:val="CVBody"/>
-        <w:spacing w:after="10" w:line="210" w:lineRule="auto"/>
+        <w:spacing w:after="6" w:line="200" w:lineRule="auto"/>
         <w:rPr>
           <w:b/>
         </w:rPr>
@@ -73,7 +73,7 @@
     <w:p>
       <w:pPr>
         <w:pStyle w:val="CVBody"/>
-        <w:spacing w:after="16" w:line="210" w:lineRule="auto"/>
+        <w:spacing w:after="10" w:line="200" w:lineRule="auto"/>
       </w:pPr>
       <w:r>
         <w:t>Bilişim Güvenliği Teknolojileri - Ön Lisans (Devam ediyor)</w:t>
@@ -82,7 +82,7 @@
     <w:p>
       <w:pPr>
         <w:pStyle w:val="CVBody"/>
-        <w:spacing w:after="10" w:line="210" w:lineRule="auto"/>
+        <w:spacing w:after="6" w:line="200" w:lineRule="auto"/>
         <w:rPr>
           <w:b/>
         </w:rPr>
@@ -97,7 +97,7 @@
     <w:p>
       <w:pPr>
         <w:pStyle w:val="CVBody"/>
-        <w:spacing w:after="16" w:line="210" w:lineRule="auto"/>
+        <w:spacing w:after="10" w:line="200" w:lineRule="auto"/>
       </w:pPr>
       <w:r>
         <w:t>İtfaiye ve Yangın Güvenliği - Mezun</w:t>
@@ -106,7 +106,7 @@
     <w:p>
       <w:pPr>
         <w:pStyle w:val="CVHeading"/>
-        <w:spacing w:before="36" w:after="16"/>
+        <w:spacing w:before="30" w:after="10"/>
       </w:pPr>
       <w:r>
         <w:t>STAJ VE UYGULAMALI DENEYİM</w:t>
@@ -115,7 +115,7 @@
     <w:p>
       <w:pPr>
         <w:pStyle w:val="CVBody"/>
-        <w:spacing w:after="10" w:line="210" w:lineRule="auto"/>
+        <w:spacing w:after="6" w:line="200" w:lineRule="auto"/>
         <w:rPr>
           <w:b/>
         </w:rPr>
@@ -130,7 +130,7 @@
     <w:p>
       <w:pPr>
         <w:pStyle w:val="CVBody"/>
-        <w:spacing w:after="16" w:line="210" w:lineRule="auto"/>
+        <w:spacing w:after="10" w:line="200" w:lineRule="auto"/>
       </w:pPr>
       <w:r>
         <w:t>Öğrenci işleri ve bilgi işlem ortamında temel teknik destek, sistem/ağ gözlemi ve dokümantasyon süreçlerinde görev aldım. Staj sürecinde yedekleme, rol tabanlı erişim, Active Directory, firewall kuralları, VLAN ve temel ağ yönetimi konularında raporlama çalışmaları yaptım.</w:t>
@@ -139,7 +139,7 @@
     <w:p>
       <w:pPr>
         <w:pStyle w:val="CVHeading"/>
-        <w:spacing w:before="36" w:after="16"/>
+        <w:spacing w:before="30" w:after="10"/>
       </w:pPr>
       <w:r>
         <w:t>SERT</w:t>
@@ -184,7 +184,7 @@
     <w:p>
       <w:pPr>
         <w:pStyle w:val="CVBody"/>
-        <w:spacing w:after="16" w:line="210" w:lineRule="auto"/>
+        <w:spacing w:after="10" w:line="196" w:lineRule="auto"/>
       </w:pPr>
       <w:r>
         <w:rPr>
@@ -234,7 +234,7 @@
     <w:p>
       <w:pPr>
         <w:pStyle w:val="CVBody"/>
-        <w:spacing w:after="16" w:line="210" w:lineRule="auto"/>
+        <w:spacing w:after="10" w:line="196" w:lineRule="auto"/>
       </w:pPr>
       <w:r>
         <w:rPr>
@@ -282,13 +282,13 @@
         <w:t>zma Testi:</w:t>
       </w:r>
       <w:r>
-        <w:t xml:space="preserve"> BTK Akademi / KASEM (2026)</w:t>
+        <w:t xml:space="preserve"> BTK Akademi (2026)</w:t>
       </w:r>
     </w:p>
     <w:p>
       <w:pPr>
         <w:pStyle w:val="CVBody"/>
-        <w:spacing w:after="16" w:line="210" w:lineRule="auto"/>
+        <w:spacing w:after="10" w:line="196" w:lineRule="auto"/>
       </w:pPr>
       <w:r>
         <w:rPr>
@@ -349,19 +349,32 @@
         <w:t>venlikte Linux:</w:t>
       </w:r>
       <w:r>
-        <w:t xml:space="preserve"> BTK Akademi (2025)</w:t>
+        <w:t xml:space="preserve"> Turkcell Akademi &amp; BTK Akademi (2025 - 2026)</w:t>
       </w:r>
     </w:p>
     <w:p>
       <w:pPr>
         <w:pStyle w:val="CVBody"/>
-        <w:spacing w:after="16" w:line="210" w:lineRule="auto"/>
+        <w:spacing w:after="10" w:line="196" w:lineRule="auto"/>
       </w:pPr>
       <w:r>
         <w:rPr>
           <w:b/>
         </w:rPr>
-        <w:t xml:space="preserve">Python ile Veri Bilimi ve Makine </w:t>
+        <w:t>Uygulama Tabanl</w:t>
+      </w:r>
+      <w:r>
+        <w:rPr>
+          <w:rFonts w:hint="cs"/>
+          <w:b/>
+        </w:rPr>
+        <w:t>ı</w:t>
+      </w:r>
+      <w:r>
+        <w:rPr>
+          <w:b/>
+        </w:rPr>
+        <w:t xml:space="preserve"> Makine </w:t>
       </w:r>
       <w:r>
         <w:rPr>
@@ -374,34 +387,16 @@
         <w:rPr>
           <w:b/>
         </w:rPr>
-        <w:t>renmesi:</w:t>
+        <w:t>renimi &amp; Python ile Veri Bilimi:</w:t>
       </w:r>
       <w:r>
-        <w:t xml:space="preserve"> Karab</w:t>
-      </w:r>
-      <w:r>
-        <w:rPr>
-          <w:rFonts w:hint="cs"/>
-        </w:rPr>
-        <w:t>ü</w:t>
-      </w:r>
-      <w:r>
-        <w:t xml:space="preserve">k </w:t>
-      </w:r>
-      <w:r>
-        <w:rPr>
-          <w:rFonts w:hint="cs"/>
-        </w:rPr>
-        <w:t>Ü</w:t>
-      </w:r>
-      <w:r>
-        <w:t>niversitesi KASEM (60 Saat, 2025)</w:t>
+        <w:t xml:space="preserve"> Turkcell Akademi &amp; KASEM (60 Saat, 2025 - 2026)</w:t>
       </w:r>
     </w:p>
     <w:p>
       <w:pPr>
         <w:pStyle w:val="CVBody"/>
-        <w:spacing w:after="16" w:line="210" w:lineRule="auto"/>
+        <w:spacing w:after="10" w:line="196" w:lineRule="auto"/>
       </w:pPr>
       <w:r>
         <w:rPr>
@@ -433,7 +428,53 @@
         <w:rPr>
           <w:b/>
         </w:rPr>
-        <w:t xml:space="preserve">i &amp; </w:t>
+        <w:t>i E</w:t>
+      </w:r>
+      <w:r>
+        <w:rPr>
+          <w:rFonts w:hint="cs"/>
+          <w:b/>
+        </w:rPr>
+        <w:t>ğ</w:t>
+      </w:r>
+      <w:r>
+        <w:rPr>
+          <w:b/>
+        </w:rPr>
+        <w:t>itimi:</w:t>
+      </w:r>
+      <w:r>
+        <w:t xml:space="preserve"> Karab</w:t>
+      </w:r>
+      <w:r>
+        <w:rPr>
+          <w:rFonts w:hint="cs"/>
+        </w:rPr>
+        <w:t>ü</w:t>
+      </w:r>
+      <w:r>
+        <w:t xml:space="preserve">k </w:t>
+      </w:r>
+      <w:r>
+        <w:rPr>
+          <w:rFonts w:hint="cs"/>
+        </w:rPr>
+        <w:t>Ü</w:t>
+      </w:r>
+      <w:r>
+        <w:t>niversitesi KASEM (160 Saat, 2025)</w:t>
+      </w:r>
+    </w:p>
+    <w:p>
+      <w:pPr>
+        <w:pStyle w:val="CVBody"/>
+        <w:spacing w:after="10" w:line="196" w:lineRule="auto"/>
+      </w:pPr>
+      <w:r>
+        <w:rPr>
+          <w:b/>
+        </w:rPr>
+        <w:t xml:space="preserve">Temel </w:t>
       </w:r>
       <w:r>
         <w:rPr>
@@ -498,7 +539,20 @@
         <w:rPr>
           <w:b/>
         </w:rPr>
-        <w:t>i:</w:t>
+        <w:t>i E</w:t>
+      </w:r>
+      <w:r>
+        <w:rPr>
+          <w:rFonts w:hint="cs"/>
+          <w:b/>
+        </w:rPr>
+        <w:t>ğ</w:t>
+      </w:r>
+      <w:r>
+        <w:rPr>
+          <w:b/>
+        </w:rPr>
+        <w:t>itimi:</w:t>
       </w:r>
       <w:r>
         <w:t xml:space="preserve"> Karab</w:t>
@@ -519,13 +573,54 @@
         <w:t>Ü</w:t>
       </w:r>
       <w:r>
-        <w:t>niversitesi KASEM (2025)</w:t>
+        <w:t>niversitesi KASEM (16 Saat, 2025)</w:t>
+      </w:r>
+    </w:p>
+    <w:p>
+      <w:pPr>
+        <w:pStyle w:val="CVBody"/>
+        <w:spacing w:after="10" w:line="196" w:lineRule="auto"/>
+      </w:pPr>
+      <w:r>
+        <w:rPr>
+          <w:b/>
+        </w:rPr>
+        <w:t xml:space="preserve">Dijital Pazarlama Stratejileri &amp; Algoritmalar </w:t>
+      </w:r>
+      <w:r>
+        <w:rPr>
+          <w:rFonts w:hint="cs"/>
+          <w:b/>
+        </w:rPr>
+        <w:t>Ç</w:t>
+      </w:r>
+      <w:r>
+        <w:rPr>
+          <w:b/>
+        </w:rPr>
+        <w:t>a</w:t>
+      </w:r>
+      <w:r>
+        <w:rPr>
+          <w:rFonts w:hint="cs"/>
+          <w:b/>
+        </w:rPr>
+        <w:t>ğı</w:t>
+      </w:r>
+      <w:r>
+        <w:rPr>
+          <w:b/>
+        </w:rPr>
+        <w:t>nda Pazarlama:</w:t>
+      </w:r>
+      <w:r>
+        <w:t xml:space="preserve"> KASEM (2025)</w:t>
       </w:r>
     </w:p>
     <w:p>
       <w:pPr>
         <w:pStyle w:val="CVHeading"/>
-        <w:spacing w:before="36" w:after="16"/>
+        <w:spacing w:before="30" w:after="10"/>
       </w:pPr>
       <w:r>
         <w:t>TEKNİK YETENEKLER</w:t>
@@ -534,7 +629,7 @@
     <w:p>
       <w:pPr>
         <w:pStyle w:val="CVBody"/>
-        <w:spacing w:after="16" w:line="210" w:lineRule="auto"/>
+        <w:spacing w:after="10" w:line="200" w:lineRule="auto"/>
       </w:pPr>
       <w:r>
         <w:rPr>
@@ -549,7 +644,7 @@
     <w:p>
       <w:pPr>
         <w:pStyle w:val="CVBody"/>
-        <w:spacing w:after="16" w:line="210" w:lineRule="auto"/>
+        <w:spacing w:after="10" w:line="200" w:lineRule="auto"/>
       </w:pPr>
       <w:r>
         <w:rPr>
@@ -564,7 +659,7 @@
     <w:p>
       <w:pPr>
         <w:pStyle w:val="CVBody"/>
-        <w:spacing w:after="16" w:line="210" w:lineRule="auto"/>
+        <w:spacing w:after="10" w:line="200" w:lineRule="auto"/>
       </w:pPr>
       <w:r>
         <w:rPr>
@@ -579,7 +674,7 @@
     <w:p>
       <w:pPr>
         <w:pStyle w:val="CVBody"/>
-        <w:spacing w:after="16" w:line="210" w:lineRule="auto"/>
+        <w:spacing w:after="10" w:line="200" w:lineRule="auto"/>
       </w:pPr>
       <w:r>
         <w:rPr>
@@ -594,7 +689,7 @@
     <w:p>
       <w:pPr>
         <w:pStyle w:val="CVHeading"/>
-        <w:spacing w:before="36" w:after="16"/>
+        <w:spacing w:before="30" w:after="10"/>
       </w:pPr>
       <w:r>
         <w:t>PROJELER</w:t>
@@ -603,7 +698,7 @@
     <w:p>
       <w:pPr>
         <w:pStyle w:val="CVBody"/>
-        <w:spacing w:after="16" w:line="210" w:lineRule="auto"/>
+        <w:spacing w:after="10" w:line="200" w:lineRule="auto"/>
       </w:pPr>
       <w:r>
         <w:rPr>
@@ -618,7 +713,7 @@
     <w:p>
       <w:pPr>
         <w:pStyle w:val="CVSmall"/>
-        <w:spacing w:after="20" w:line="200" w:lineRule="auto"/>
+        <w:spacing w:after="16" w:line="190" w:lineRule="auto"/>
       </w:pPr>
       <w:r>
         <w:rPr>
@@ -639,7 +734,7 @@
     <w:p>
       <w:pPr>
         <w:pStyle w:val="CVBody"/>
-        <w:spacing w:after="16" w:line="210" w:lineRule="auto"/>
+        <w:spacing w:after="10" w:line="200" w:lineRule="auto"/>
       </w:pPr>
       <w:r>
         <w:rPr>
@@ -654,7 +749,7 @@
     <w:p>
       <w:pPr>
         <w:pStyle w:val="CVSmall"/>
-        <w:spacing w:after="20" w:line="200" w:lineRule="auto"/>
+        <w:spacing w:after="16" w:line="190" w:lineRule="auto"/>
       </w:pPr>
       <w:r>
         <w:rPr>
@@ -675,7 +770,7 @@
     <w:p>
       <w:pPr>
         <w:pStyle w:val="CVBody"/>
-        <w:spacing w:after="16" w:line="210" w:lineRule="auto"/>
+        <w:spacing w:after="10" w:line="200" w:lineRule="auto"/>
       </w:pPr>
       <w:r>
         <w:rPr>
@@ -693,7 +788,7 @@
     <w:p>
       <w:pPr>
         <w:pStyle w:val="CVSmall"/>
-        <w:spacing w:after="20" w:line="200" w:lineRule="auto"/>
+        <w:spacing w:after="16" w:line="190" w:lineRule="auto"/>
       </w:pPr>
       <w:r>
         <w:rPr>
@@ -714,7 +809,7 @@
     <w:p>
       <w:pPr>
         <w:pStyle w:val="CVHeading"/>
-        <w:spacing w:before="36" w:after="16"/>
+        <w:spacing w:before="30" w:after="10"/>
       </w:pPr>
       <w:r>
         <w:t>DİL</w:t>
@@ -723,7 +818,7 @@
     <w:p>
       <w:pPr>
         <w:pStyle w:val="CVBody"/>
-        <w:spacing w:after="10" w:line="210" w:lineRule="auto"/>
+        <w:spacing w:after="6" w:line="200" w:lineRule="auto"/>
       </w:pPr>
       <w:r>
         <w:rPr>
@@ -738,7 +833,7 @@
     <w:p>
       <w:pPr>
         <w:pStyle w:val="CVBody"/>
-        <w:spacing w:after="10" w:line="210" w:lineRule="auto"/>
+        <w:spacing w:after="6" w:line="200" w:lineRule="auto"/>
       </w:pPr>
       <w:r>
         <w:rPr>
@@ -753,7 +848,7 @@
     <w:p>
       <w:pPr>
         <w:pStyle w:val="CVBody"/>
-        <w:spacing w:after="16" w:line="210" w:lineRule="auto"/>
+        <w:spacing w:after="10" w:line="200" w:lineRule="auto"/>
       </w:pPr>
       <w:r>
         <w:t>Teknik doküman okuma, temel yazılı iletişim ve yazılım/siber güvenlik alanındaki İngilizce kaynakları takip etme düzeyinde.</w:t>
@@ -762,7 +857,7 @@
     <w:p>
       <w:pPr>
         <w:pStyle w:val="CVHeading"/>
-        <w:spacing w:before="36" w:after="16"/>
+        <w:spacing w:before="30" w:after="10"/>
       </w:pPr>
       <w:r>
         <w:t>ÇALIŞMA YAKLAŞIMI</w:t>
@@ -771,7 +866,7 @@
     <w:p>
       <w:pPr>
         <w:pStyle w:val="CVBody"/>
-        <w:spacing w:after="16" w:line="210" w:lineRule="auto"/>
+        <w:spacing w:after="10" w:line="200" w:lineRule="auto"/>
       </w:pPr>
       <w:r>
         <w:t>Projelerimde ana fikir, geliştirme süreci, testler ve düzenlemeler tarafımdan yürütülmektedir. Yapay zekâ araçlarını planlama, dokümantasyon, hata ayıklama ve iyileştirme süreçlerinde yardımcı araç olarak kullanıyorum. Genel yaklaşımım, el emeği ağırlıklı ve geliştirici kontrollü üretimdir.</w:t>
@@ -779,7 +874,7 @@
     </w:p>
     <w:sectPr>
       <w:pgSz w:w="12240" w:h="15840"/>
-      <w:pgMar w:top="440" w:right="640" w:bottom="440" w:left="640" w:header="720" w:footer="720" w:gutter="0"/>
+      <w:pgMar w:top="360" w:right="560" w:bottom="360" w:left="560" w:header="720" w:footer="720" w:gutter="0"/>
       <w:cols w:space="720"/>
       <w:docGrid w:linePitch="360"/>
     </w:sectPr>
@@ -960,31 +1055,31 @@
       </w:rPr>
     </w:lvl>
   </w:abstractNum>
-  <w:num w:numId="1" w16cid:durableId="982808824">
+  <w:num w:numId="1" w16cid:durableId="1082918287">
     <w:abstractNumId w:val="8"/>
   </w:num>
-  <w:num w:numId="2" w16cid:durableId="359018891">
+  <w:num w:numId="2" w16cid:durableId="1495143902">
     <w:abstractNumId w:val="6"/>
   </w:num>
-  <w:num w:numId="3" w16cid:durableId="799880335">
+  <w:num w:numId="3" w16cid:durableId="972323760">
     <w:abstractNumId w:val="5"/>
   </w:num>
-  <w:num w:numId="4" w16cid:durableId="1652100515">
+  <w:num w:numId="4" w16cid:durableId="180976111">
     <w:abstractNumId w:val="4"/>
   </w:num>
-  <w:num w:numId="5" w16cid:durableId="1290628187">
+  <w:num w:numId="5" w16cid:durableId="310257128">
     <w:abstractNumId w:val="7"/>
   </w:num>
-  <w:num w:numId="6" w16cid:durableId="950941634">
+  <w:num w:numId="6" w16cid:durableId="1402168596">
     <w:abstractNumId w:val="3"/>
   </w:num>
-  <w:num w:numId="7" w16cid:durableId="509880395">
+  <w:num w:numId="7" w16cid:durableId="1833718096">
     <w:abstractNumId w:val="2"/>
   </w:num>
-  <w:num w:numId="8" w16cid:durableId="754977824">
+  <w:num w:numId="8" w16cid:durableId="1384014140">
     <w:abstractNumId w:val="1"/>
   </w:num>
-  <w:num w:numId="9" w16cid:durableId="1388184618">
+  <w:num w:numId="9" w16cid:durableId="751121470">
     <w:abstractNumId w:val="0"/>
   </w:num>
 </w:numbering>

</xml_diff>

<commit_message>
Include all 11 individual certificates in CV and website
</commit_message>
<xml_diff>
--- a/assets/Muhammet-Emin-Gul-CV.docx
+++ b/assets/Muhammet-Emin-Gul-CV.docx
@@ -5,7 +5,7 @@
     <w:p>
       <w:pPr>
         <w:pStyle w:val="CVTitle"/>
-        <w:spacing w:after="10"/>
+        <w:spacing w:after="6"/>
         <w:jc w:val="center"/>
       </w:pPr>
       <w:r>
@@ -15,7 +15,7 @@
     <w:p>
       <w:pPr>
         <w:pStyle w:val="CVSmall"/>
-        <w:spacing w:after="16" w:line="190" w:lineRule="auto"/>
+        <w:spacing w:after="10" w:line="180" w:lineRule="auto"/>
         <w:jc w:val="center"/>
       </w:pPr>
       <w:r>
@@ -28,7 +28,7 @@
     <w:p>
       <w:pPr>
         <w:pStyle w:val="CVHeading"/>
-        <w:spacing w:before="30" w:after="10"/>
+        <w:spacing w:before="24" w:after="6"/>
       </w:pPr>
       <w:r>
         <w:t>PROFİL</w:t>
@@ -37,7 +37,7 @@
     <w:p>
       <w:pPr>
         <w:pStyle w:val="CVBody"/>
-        <w:spacing w:after="10" w:line="200" w:lineRule="auto"/>
+        <w:spacing w:after="6" w:line="190" w:lineRule="auto"/>
       </w:pPr>
       <w:r>
         <w:t xml:space="preserve">Bilişim Güvenliği Teknolojileri alanında eğitim gören, siber güvenlik, ağ güvenliği ve yazılım geliştirme konularına ilgi duyan bir öğrenciyim. Python, Flutter, SQL ve temel web teknolojileri ile projeler geliştiriyorum. Ağ tarama, risk analizi, parola yönetimi, yerel veri saklama ve kullanıcı arayüzü geliştirme alanlarında uygulamalı çalışmalar yaptım. Kariyer hedefim; siber güvenlik, ağ güvenliği, teknik destek veya yazılım geliştirme alanlarında kendimi geliştirerek profesyonel iş hayatına güçlü bir başlangıç yapmaktır. </w:t>
@@ -49,7 +49,7 @@
     <w:p>
       <w:pPr>
         <w:pStyle w:val="CVHeading"/>
-        <w:spacing w:before="30" w:after="10"/>
+        <w:spacing w:before="24" w:after="6"/>
       </w:pPr>
       <w:r>
         <w:t>EĞİTİM</w:t>
@@ -58,7 +58,7 @@
     <w:p>
       <w:pPr>
         <w:pStyle w:val="CVBody"/>
-        <w:spacing w:after="6" w:line="200" w:lineRule="auto"/>
+        <w:spacing w:after="4" w:line="190" w:lineRule="auto"/>
         <w:rPr>
           <w:b/>
         </w:rPr>
@@ -73,7 +73,7 @@
     <w:p>
       <w:pPr>
         <w:pStyle w:val="CVBody"/>
-        <w:spacing w:after="10" w:line="200" w:lineRule="auto"/>
+        <w:spacing w:after="6" w:line="190" w:lineRule="auto"/>
       </w:pPr>
       <w:r>
         <w:t>Bilişim Güvenliği Teknolojileri - Ön Lisans (Devam ediyor)</w:t>
@@ -82,7 +82,7 @@
     <w:p>
       <w:pPr>
         <w:pStyle w:val="CVBody"/>
-        <w:spacing w:after="6" w:line="200" w:lineRule="auto"/>
+        <w:spacing w:after="4" w:line="190" w:lineRule="auto"/>
         <w:rPr>
           <w:b/>
         </w:rPr>
@@ -97,7 +97,7 @@
     <w:p>
       <w:pPr>
         <w:pStyle w:val="CVBody"/>
-        <w:spacing w:after="10" w:line="200" w:lineRule="auto"/>
+        <w:spacing w:after="6" w:line="190" w:lineRule="auto"/>
       </w:pPr>
       <w:r>
         <w:t>İtfaiye ve Yangın Güvenliği - Mezun</w:t>
@@ -106,7 +106,7 @@
     <w:p>
       <w:pPr>
         <w:pStyle w:val="CVHeading"/>
-        <w:spacing w:before="30" w:after="10"/>
+        <w:spacing w:before="24" w:after="6"/>
       </w:pPr>
       <w:r>
         <w:t>STAJ VE UYGULAMALI DENEYİM</w:t>
@@ -115,7 +115,7 @@
     <w:p>
       <w:pPr>
         <w:pStyle w:val="CVBody"/>
-        <w:spacing w:after="6" w:line="200" w:lineRule="auto"/>
+        <w:spacing w:after="4" w:line="190" w:lineRule="auto"/>
         <w:rPr>
           <w:b/>
         </w:rPr>
@@ -130,7 +130,7 @@
     <w:p>
       <w:pPr>
         <w:pStyle w:val="CVBody"/>
-        <w:spacing w:after="10" w:line="200" w:lineRule="auto"/>
+        <w:spacing w:after="6" w:line="190" w:lineRule="auto"/>
       </w:pPr>
       <w:r>
         <w:t>Öğrenci işleri ve bilgi işlem ortamında temel teknik destek, sistem/ağ gözlemi ve dokümantasyon süreçlerinde görev aldım. Staj sürecinde yedekleme, rol tabanlı erişim, Active Directory, firewall kuralları, VLAN ve temel ağ yönetimi konularında raporlama çalışmaları yaptım.</w:t>
@@ -139,7 +139,7 @@
     <w:p>
       <w:pPr>
         <w:pStyle w:val="CVHeading"/>
-        <w:spacing w:before="30" w:after="10"/>
+        <w:spacing w:before="24" w:after="6"/>
       </w:pPr>
       <w:r>
         <w:t>SERT</w:t>
@@ -178,13 +178,13 @@
         <w:t>İ</w:t>
       </w:r>
       <w:r>
-        <w:t>MLER</w:t>
+        <w:t>MLER (11 Belge)</w:t>
       </w:r>
     </w:p>
     <w:p>
       <w:pPr>
         <w:pStyle w:val="CVBody"/>
-        <w:spacing w:after="10" w:line="196" w:lineRule="auto"/>
+        <w:spacing w:after="6" w:line="184" w:lineRule="auto"/>
       </w:pPr>
       <w:r>
         <w:rPr>
@@ -234,7 +234,7 @@
     <w:p>
       <w:pPr>
         <w:pStyle w:val="CVBody"/>
-        <w:spacing w:after="10" w:line="196" w:lineRule="auto"/>
+        <w:spacing w:after="6" w:line="184" w:lineRule="auto"/>
       </w:pPr>
       <w:r>
         <w:rPr>
@@ -288,7 +288,7 @@
     <w:p>
       <w:pPr>
         <w:pStyle w:val="CVBody"/>
-        <w:spacing w:after="10" w:line="196" w:lineRule="auto"/>
+        <w:spacing w:after="6" w:line="184" w:lineRule="auto"/>
       </w:pPr>
       <w:r>
         <w:rPr>
@@ -333,7 +333,57 @@
         <w:rPr>
           <w:b/>
         </w:rPr>
-        <w:t xml:space="preserve"> &amp; Siber G</w:t>
+        <w:t xml:space="preserve"> (Ba</w:t>
+      </w:r>
+      <w:r>
+        <w:rPr>
+          <w:rFonts w:hint="cs"/>
+          <w:b/>
+        </w:rPr>
+        <w:t>ş</w:t>
+      </w:r>
+      <w:r>
+        <w:rPr>
+          <w:b/>
+        </w:rPr>
+        <w:t>ar</w:t>
+      </w:r>
+      <w:r>
+        <w:rPr>
+          <w:rFonts w:hint="cs"/>
+          <w:b/>
+        </w:rPr>
+        <w:t>ı</w:t>
+      </w:r>
+      <w:r>
+        <w:rPr>
+          <w:b/>
+        </w:rPr>
+        <w:t xml:space="preserve"> Belgesi):</w:t>
+      </w:r>
+      <w:r>
+        <w:t xml:space="preserve"> Turkcell Akademi &amp; Gelece</w:t>
+      </w:r>
+      <w:r>
+        <w:rPr>
+          <w:rFonts w:hint="cs"/>
+        </w:rPr>
+        <w:t>ğ</w:t>
+      </w:r>
+      <w:r>
+        <w:t>i Yazanlar (2026)</w:t>
+      </w:r>
+    </w:p>
+    <w:p>
+      <w:pPr>
+        <w:pStyle w:val="CVBody"/>
+        <w:spacing w:after="6" w:line="184" w:lineRule="auto"/>
+      </w:pPr>
+      <w:r>
+        <w:rPr>
+          <w:b/>
+        </w:rPr>
+        <w:t>Siber G</w:t>
       </w:r>
       <w:r>
         <w:rPr>
@@ -346,16 +396,83 @@
         <w:rPr>
           <w:b/>
         </w:rPr>
-        <w:t>venlikte Linux:</w:t>
-      </w:r>
-      <w:r>
-        <w:t xml:space="preserve"> Turkcell Akademi &amp; BTK Akademi (2025 - 2026)</w:t>
+        <w:t>venli</w:t>
+      </w:r>
+      <w:r>
+        <w:rPr>
+          <w:rFonts w:hint="cs"/>
+          <w:b/>
+        </w:rPr>
+        <w:t>ğ</w:t>
+      </w:r>
+      <w:r>
+        <w:rPr>
+          <w:b/>
+        </w:rPr>
+        <w:t>e Giri</w:t>
+      </w:r>
+      <w:r>
+        <w:rPr>
+          <w:rFonts w:hint="cs"/>
+          <w:b/>
+        </w:rPr>
+        <w:t>ş</w:t>
+      </w:r>
+      <w:r>
+        <w:rPr>
+          <w:b/>
+        </w:rPr>
+        <w:t>:</w:t>
+      </w:r>
+      <w:r>
+        <w:t xml:space="preserve"> BTK Akademi (2025)</w:t>
       </w:r>
     </w:p>
     <w:p>
       <w:pPr>
         <w:pStyle w:val="CVBody"/>
-        <w:spacing w:after="10" w:line="196" w:lineRule="auto"/>
+        <w:spacing w:after="6" w:line="184" w:lineRule="auto"/>
+      </w:pPr>
+      <w:r>
+        <w:rPr>
+          <w:b/>
+        </w:rPr>
+        <w:t>Siber G</w:t>
+      </w:r>
+      <w:r>
+        <w:rPr>
+          <w:rFonts w:hint="cs"/>
+          <w:b/>
+        </w:rPr>
+        <w:t>ü</w:t>
+      </w:r>
+      <w:r>
+        <w:rPr>
+          <w:b/>
+        </w:rPr>
+        <w:t xml:space="preserve">venlikte Linux </w:t>
+      </w:r>
+      <w:r>
+        <w:rPr>
+          <w:rFonts w:hint="cs"/>
+          <w:b/>
+        </w:rPr>
+        <w:t>İş</w:t>
+      </w:r>
+      <w:r>
+        <w:rPr>
+          <w:b/>
+        </w:rPr>
+        <w:t>letim Sistemleri:</w:t>
+      </w:r>
+      <w:r>
+        <w:t xml:space="preserve"> BTK Akademi (2025)</w:t>
+      </w:r>
+    </w:p>
+    <w:p>
+      <w:pPr>
+        <w:pStyle w:val="CVBody"/>
+        <w:spacing w:after="6" w:line="184" w:lineRule="auto"/>
       </w:pPr>
       <w:r>
         <w:rPr>
@@ -387,16 +504,110 @@
         <w:rPr>
           <w:b/>
         </w:rPr>
-        <w:t>renimi &amp; Python ile Veri Bilimi:</w:t>
-      </w:r>
-      <w:r>
-        <w:t xml:space="preserve"> Turkcell Akademi &amp; KASEM (60 Saat, 2025 - 2026)</w:t>
+        <w:t>renimi (Ba</w:t>
+      </w:r>
+      <w:r>
+        <w:rPr>
+          <w:rFonts w:hint="cs"/>
+          <w:b/>
+        </w:rPr>
+        <w:t>ş</w:t>
+      </w:r>
+      <w:r>
+        <w:rPr>
+          <w:b/>
+        </w:rPr>
+        <w:t>ar</w:t>
+      </w:r>
+      <w:r>
+        <w:rPr>
+          <w:rFonts w:hint="cs"/>
+          <w:b/>
+        </w:rPr>
+        <w:t>ı</w:t>
+      </w:r>
+      <w:r>
+        <w:rPr>
+          <w:b/>
+        </w:rPr>
+        <w:t xml:space="preserve"> Belgesi):</w:t>
+      </w:r>
+      <w:r>
+        <w:t xml:space="preserve"> Turkcell Akademi &amp; Gelece</w:t>
+      </w:r>
+      <w:r>
+        <w:rPr>
+          <w:rFonts w:hint="cs"/>
+        </w:rPr>
+        <w:t>ğ</w:t>
+      </w:r>
+      <w:r>
+        <w:t>i Yazanlar (2026)</w:t>
       </w:r>
     </w:p>
     <w:p>
       <w:pPr>
         <w:pStyle w:val="CVBody"/>
-        <w:spacing w:after="10" w:line="196" w:lineRule="auto"/>
+        <w:spacing w:after="6" w:line="184" w:lineRule="auto"/>
+      </w:pPr>
+      <w:r>
+        <w:rPr>
+          <w:b/>
+        </w:rPr>
+        <w:t xml:space="preserve">Python ile Veri Bilimi ve Makine </w:t>
+      </w:r>
+      <w:r>
+        <w:rPr>
+          <w:rFonts w:hint="cs"/>
+          <w:b/>
+        </w:rPr>
+        <w:t>Öğ</w:t>
+      </w:r>
+      <w:r>
+        <w:rPr>
+          <w:b/>
+        </w:rPr>
+        <w:t>renmesi E</w:t>
+      </w:r>
+      <w:r>
+        <w:rPr>
+          <w:rFonts w:hint="cs"/>
+          <w:b/>
+        </w:rPr>
+        <w:t>ğ</w:t>
+      </w:r>
+      <w:r>
+        <w:rPr>
+          <w:b/>
+        </w:rPr>
+        <w:t>itimi:</w:t>
+      </w:r>
+      <w:r>
+        <w:t xml:space="preserve"> Karab</w:t>
+      </w:r>
+      <w:r>
+        <w:rPr>
+          <w:rFonts w:hint="cs"/>
+        </w:rPr>
+        <w:t>ü</w:t>
+      </w:r>
+      <w:r>
+        <w:t xml:space="preserve">k </w:t>
+      </w:r>
+      <w:r>
+        <w:rPr>
+          <w:rFonts w:hint="cs"/>
+        </w:rPr>
+        <w:t>Ü</w:t>
+      </w:r>
+      <w:r>
+        <w:t>niversitesi KASEM (60 Saat, 2025)</w:t>
+      </w:r>
+    </w:p>
+    <w:p>
+      <w:pPr>
+        <w:pStyle w:val="CVBody"/>
+        <w:spacing w:after="6" w:line="184" w:lineRule="auto"/>
       </w:pPr>
       <w:r>
         <w:rPr>
@@ -468,7 +679,7 @@
     <w:p>
       <w:pPr>
         <w:pStyle w:val="CVBody"/>
-        <w:spacing w:after="10" w:line="196" w:lineRule="auto"/>
+        <w:spacing w:after="6" w:line="184" w:lineRule="auto"/>
       </w:pPr>
       <w:r>
         <w:rPr>
@@ -579,13 +790,13 @@
     <w:p>
       <w:pPr>
         <w:pStyle w:val="CVBody"/>
-        <w:spacing w:after="10" w:line="196" w:lineRule="auto"/>
+        <w:spacing w:after="6" w:line="184" w:lineRule="auto"/>
       </w:pPr>
       <w:r>
         <w:rPr>
           <w:b/>
         </w:rPr>
-        <w:t xml:space="preserve">Dijital Pazarlama Stratejileri &amp; Algoritmalar </w:t>
+        <w:t xml:space="preserve">Algoritmalar </w:t>
       </w:r>
       <w:r>
         <w:rPr>
@@ -614,13 +825,64 @@
         <w:t>nda Pazarlama:</w:t>
       </w:r>
       <w:r>
-        <w:t xml:space="preserve"> KASEM (2025)</w:t>
+        <w:t xml:space="preserve"> Karab</w:t>
+      </w:r>
+      <w:r>
+        <w:rPr>
+          <w:rFonts w:hint="cs"/>
+        </w:rPr>
+        <w:t>ü</w:t>
+      </w:r>
+      <w:r>
+        <w:t xml:space="preserve">k </w:t>
+      </w:r>
+      <w:r>
+        <w:rPr>
+          <w:rFonts w:hint="cs"/>
+        </w:rPr>
+        <w:t>Ü</w:t>
+      </w:r>
+      <w:r>
+        <w:t>niversitesi KASEM (2025)</w:t>
+      </w:r>
+    </w:p>
+    <w:p>
+      <w:pPr>
+        <w:pStyle w:val="CVBody"/>
+        <w:spacing w:after="6" w:line="184" w:lineRule="auto"/>
+      </w:pPr>
+      <w:r>
+        <w:rPr>
+          <w:b/>
+        </w:rPr>
+        <w:t>Dijital Pazarlama Stratejileri:</w:t>
+      </w:r>
+      <w:r>
+        <w:t xml:space="preserve"> Karab</w:t>
+      </w:r>
+      <w:r>
+        <w:rPr>
+          <w:rFonts w:hint="cs"/>
+        </w:rPr>
+        <w:t>ü</w:t>
+      </w:r>
+      <w:r>
+        <w:t xml:space="preserve">k </w:t>
+      </w:r>
+      <w:r>
+        <w:rPr>
+          <w:rFonts w:hint="cs"/>
+        </w:rPr>
+        <w:t>Ü</w:t>
+      </w:r>
+      <w:r>
+        <w:t>niversitesi KASEM (2025)</w:t>
       </w:r>
     </w:p>
     <w:p>
       <w:pPr>
         <w:pStyle w:val="CVHeading"/>
-        <w:spacing w:before="30" w:after="10"/>
+        <w:spacing w:before="24" w:after="6"/>
       </w:pPr>
       <w:r>
         <w:t>TEKNİK YETENEKLER</w:t>
@@ -629,7 +891,7 @@
     <w:p>
       <w:pPr>
         <w:pStyle w:val="CVBody"/>
-        <w:spacing w:after="10" w:line="200" w:lineRule="auto"/>
+        <w:spacing w:after="6" w:line="190" w:lineRule="auto"/>
       </w:pPr>
       <w:r>
         <w:rPr>
@@ -644,7 +906,7 @@
     <w:p>
       <w:pPr>
         <w:pStyle w:val="CVBody"/>
-        <w:spacing w:after="10" w:line="200" w:lineRule="auto"/>
+        <w:spacing w:after="6" w:line="190" w:lineRule="auto"/>
       </w:pPr>
       <w:r>
         <w:rPr>
@@ -659,7 +921,7 @@
     <w:p>
       <w:pPr>
         <w:pStyle w:val="CVBody"/>
-        <w:spacing w:after="10" w:line="200" w:lineRule="auto"/>
+        <w:spacing w:after="6" w:line="190" w:lineRule="auto"/>
       </w:pPr>
       <w:r>
         <w:rPr>
@@ -674,7 +936,7 @@
     <w:p>
       <w:pPr>
         <w:pStyle w:val="CVBody"/>
-        <w:spacing w:after="10" w:line="200" w:lineRule="auto"/>
+        <w:spacing w:after="6" w:line="190" w:lineRule="auto"/>
       </w:pPr>
       <w:r>
         <w:rPr>
@@ -689,7 +951,7 @@
     <w:p>
       <w:pPr>
         <w:pStyle w:val="CVHeading"/>
-        <w:spacing w:before="30" w:after="10"/>
+        <w:spacing w:before="24" w:after="6"/>
       </w:pPr>
       <w:r>
         <w:t>PROJELER</w:t>
@@ -698,7 +960,7 @@
     <w:p>
       <w:pPr>
         <w:pStyle w:val="CVBody"/>
-        <w:spacing w:after="10" w:line="200" w:lineRule="auto"/>
+        <w:spacing w:after="6" w:line="190" w:lineRule="auto"/>
       </w:pPr>
       <w:r>
         <w:rPr>
@@ -713,7 +975,7 @@
     <w:p>
       <w:pPr>
         <w:pStyle w:val="CVSmall"/>
-        <w:spacing w:after="16" w:line="190" w:lineRule="auto"/>
+        <w:spacing w:after="10" w:line="180" w:lineRule="auto"/>
       </w:pPr>
       <w:r>
         <w:rPr>
@@ -734,7 +996,7 @@
     <w:p>
       <w:pPr>
         <w:pStyle w:val="CVBody"/>
-        <w:spacing w:after="10" w:line="200" w:lineRule="auto"/>
+        <w:spacing w:after="6" w:line="190" w:lineRule="auto"/>
       </w:pPr>
       <w:r>
         <w:rPr>
@@ -749,7 +1011,7 @@
     <w:p>
       <w:pPr>
         <w:pStyle w:val="CVSmall"/>
-        <w:spacing w:after="16" w:line="190" w:lineRule="auto"/>
+        <w:spacing w:after="10" w:line="180" w:lineRule="auto"/>
       </w:pPr>
       <w:r>
         <w:rPr>
@@ -770,7 +1032,7 @@
     <w:p>
       <w:pPr>
         <w:pStyle w:val="CVBody"/>
-        <w:spacing w:after="10" w:line="200" w:lineRule="auto"/>
+        <w:spacing w:after="6" w:line="190" w:lineRule="auto"/>
       </w:pPr>
       <w:r>
         <w:rPr>
@@ -788,7 +1050,7 @@
     <w:p>
       <w:pPr>
         <w:pStyle w:val="CVSmall"/>
-        <w:spacing w:after="16" w:line="190" w:lineRule="auto"/>
+        <w:spacing w:after="10" w:line="180" w:lineRule="auto"/>
       </w:pPr>
       <w:r>
         <w:rPr>
@@ -809,7 +1071,7 @@
     <w:p>
       <w:pPr>
         <w:pStyle w:val="CVHeading"/>
-        <w:spacing w:before="30" w:after="10"/>
+        <w:spacing w:before="24" w:after="6"/>
       </w:pPr>
       <w:r>
         <w:t>DİL</w:t>
@@ -818,7 +1080,7 @@
     <w:p>
       <w:pPr>
         <w:pStyle w:val="CVBody"/>
-        <w:spacing w:after="6" w:line="200" w:lineRule="auto"/>
+        <w:spacing w:after="4" w:line="190" w:lineRule="auto"/>
       </w:pPr>
       <w:r>
         <w:rPr>
@@ -833,7 +1095,7 @@
     <w:p>
       <w:pPr>
         <w:pStyle w:val="CVBody"/>
-        <w:spacing w:after="6" w:line="200" w:lineRule="auto"/>
+        <w:spacing w:after="4" w:line="190" w:lineRule="auto"/>
       </w:pPr>
       <w:r>
         <w:rPr>
@@ -848,7 +1110,7 @@
     <w:p>
       <w:pPr>
         <w:pStyle w:val="CVBody"/>
-        <w:spacing w:after="10" w:line="200" w:lineRule="auto"/>
+        <w:spacing w:after="6" w:line="190" w:lineRule="auto"/>
       </w:pPr>
       <w:r>
         <w:t>Teknik doküman okuma, temel yazılı iletişim ve yazılım/siber güvenlik alanındaki İngilizce kaynakları takip etme düzeyinde.</w:t>
@@ -857,7 +1119,7 @@
     <w:p>
       <w:pPr>
         <w:pStyle w:val="CVHeading"/>
-        <w:spacing w:before="30" w:after="10"/>
+        <w:spacing w:before="24" w:after="6"/>
       </w:pPr>
       <w:r>
         <w:t>ÇALIŞMA YAKLAŞIMI</w:t>
@@ -866,7 +1128,7 @@
     <w:p>
       <w:pPr>
         <w:pStyle w:val="CVBody"/>
-        <w:spacing w:after="10" w:line="200" w:lineRule="auto"/>
+        <w:spacing w:after="6" w:line="190" w:lineRule="auto"/>
       </w:pPr>
       <w:r>
         <w:t>Projelerimde ana fikir, geliştirme süreci, testler ve düzenlemeler tarafımdan yürütülmektedir. Yapay zekâ araçlarını planlama, dokümantasyon, hata ayıklama ve iyileştirme süreçlerinde yardımcı araç olarak kullanıyorum. Genel yaklaşımım, el emeği ağırlıklı ve geliştirici kontrollü üretimdir.</w:t>
@@ -874,7 +1136,7 @@
     </w:p>
     <w:sectPr>
       <w:pgSz w:w="12240" w:h="15840"/>
-      <w:pgMar w:top="360" w:right="560" w:bottom="360" w:left="560" w:header="720" w:footer="720" w:gutter="0"/>
+      <w:pgMar w:top="300" w:right="520" w:bottom="300" w:left="520" w:header="720" w:footer="720" w:gutter="0"/>
       <w:cols w:space="720"/>
       <w:docGrid w:linePitch="360"/>
     </w:sectPr>
@@ -1055,31 +1317,31 @@
       </w:rPr>
     </w:lvl>
   </w:abstractNum>
-  <w:num w:numId="1" w16cid:durableId="1082918287">
+  <w:num w:numId="1" w16cid:durableId="1187015548">
     <w:abstractNumId w:val="8"/>
   </w:num>
-  <w:num w:numId="2" w16cid:durableId="1495143902">
+  <w:num w:numId="2" w16cid:durableId="1079836728">
     <w:abstractNumId w:val="6"/>
   </w:num>
-  <w:num w:numId="3" w16cid:durableId="972323760">
+  <w:num w:numId="3" w16cid:durableId="1871871349">
     <w:abstractNumId w:val="5"/>
   </w:num>
-  <w:num w:numId="4" w16cid:durableId="180976111">
+  <w:num w:numId="4" w16cid:durableId="872695148">
     <w:abstractNumId w:val="4"/>
   </w:num>
-  <w:num w:numId="5" w16cid:durableId="310257128">
+  <w:num w:numId="5" w16cid:durableId="100956574">
     <w:abstractNumId w:val="7"/>
   </w:num>
-  <w:num w:numId="6" w16cid:durableId="1402168596">
+  <w:num w:numId="6" w16cid:durableId="403257188">
     <w:abstractNumId w:val="3"/>
   </w:num>
-  <w:num w:numId="7" w16cid:durableId="1833718096">
+  <w:num w:numId="7" w16cid:durableId="49958649">
     <w:abstractNumId w:val="2"/>
   </w:num>
-  <w:num w:numId="8" w16cid:durableId="1384014140">
+  <w:num w:numId="8" w16cid:durableId="171646626">
     <w:abstractNumId w:val="1"/>
   </w:num>
-  <w:num w:numId="9" w16cid:durableId="751121470">
+  <w:num w:numId="9" w16cid:durableId="851381381">
     <w:abstractNumId w:val="0"/>
   </w:num>
 </w:numbering>

</xml_diff>